<commit_message>
doc(note_de_cadrage): Ajout de la partie Méthodes et Organisation
</commit_message>
<xml_diff>
--- a/note-de-cadrage/note_de_cadrage_v1.5.docx
+++ b/note-de-cadrage/note_de_cadrage_v1.5.docx
@@ -16899,7 +16899,25 @@
                 <w:bCs/>
                 <w:sz w:val="24"/>
               </w:rPr>
-              <w:t xml:space="preserve"> fonctionnel (user stories, DoD)</w:t>
+              <w:t xml:space="preserve"> </w:t>
+            </w:r>
+            <w:proofErr w:type="spellStart"/>
+            <w:r>
+              <w:rPr>
+                <w:rFonts w:ascii="Arial" w:hAnsi="Arial" w:cs="Arial"/>
+                <w:bCs/>
+                <w:sz w:val="24"/>
+              </w:rPr>
+              <w:t>fonctionnel</w:t>
+            </w:r>
+            <w:proofErr w:type="spellEnd"/>
+            <w:r>
+              <w:rPr>
+                <w:rFonts w:ascii="Arial" w:hAnsi="Arial" w:cs="Arial"/>
+                <w:bCs/>
+                <w:sz w:val="24"/>
+              </w:rPr>
+              <w:t xml:space="preserve"> (user stories, DoD)</w:t>
             </w:r>
           </w:p>
         </w:tc>
@@ -18162,6 +18180,7 @@
                 <w:sz w:val="24"/>
               </w:rPr>
             </w:pPr>
+            <w:proofErr w:type="spellStart"/>
             <w:r>
               <w:rPr>
                 <w:rFonts w:ascii="Arial" w:hAnsi="Arial" w:cs="Arial"/>
@@ -18169,7 +18188,17 @@
                 <w:spacing w:val="-2"/>
                 <w:sz w:val="24"/>
               </w:rPr>
-              <w:t xml:space="preserve">Sécurité </w:t>
+              <w:t>Sécurité</w:t>
+            </w:r>
+            <w:proofErr w:type="spellEnd"/>
+            <w:r>
+              <w:rPr>
+                <w:rFonts w:ascii="Arial" w:hAnsi="Arial" w:cs="Arial"/>
+                <w:bCs/>
+                <w:spacing w:val="-2"/>
+                <w:sz w:val="24"/>
+              </w:rPr>
+              <w:t xml:space="preserve"> </w:t>
             </w:r>
             <w:proofErr w:type="spellStart"/>
             <w:r>
@@ -19510,31 +19539,7 @@
                 <w:bCs/>
                 <w:sz w:val="24"/>
               </w:rPr>
-              <w:t xml:space="preserve"> Responsable </w:t>
-            </w:r>
-            <w:r>
-              <w:rPr>
-                <w:b/>
-                <w:bCs/>
-                <w:sz w:val="24"/>
-              </w:rPr>
-              <w:t>F</w:t>
-            </w:r>
-            <w:r>
-              <w:rPr>
-                <w:b/>
-                <w:bCs/>
-                <w:sz w:val="24"/>
-              </w:rPr>
-              <w:t>ront</w:t>
-            </w:r>
-            <w:r>
-              <w:rPr>
-                <w:b/>
-                <w:bCs/>
-                <w:sz w:val="24"/>
-              </w:rPr>
-              <w:t>-end</w:t>
+              <w:t xml:space="preserve"> Responsable Front-end</w:t>
             </w:r>
           </w:p>
         </w:tc>
@@ -19609,15 +19614,7 @@
                 <w:bCs/>
                 <w:sz w:val="24"/>
               </w:rPr>
-              <w:t xml:space="preserve"> Responsable </w:t>
-            </w:r>
-            <w:r>
-              <w:rPr>
-                <w:b/>
-                <w:bCs/>
-                <w:sz w:val="24"/>
-              </w:rPr>
-              <w:t>Backlog</w:t>
+              <w:t xml:space="preserve"> Responsable Backlog</w:t>
             </w:r>
           </w:p>
         </w:tc>
@@ -19711,15 +19708,7 @@
                 <w:bCs/>
                 <w:sz w:val="24"/>
               </w:rPr>
-              <w:t xml:space="preserve"> Responsable </w:t>
-            </w:r>
-            <w:r>
-              <w:rPr>
-                <w:b/>
-                <w:bCs/>
-                <w:sz w:val="24"/>
-              </w:rPr>
-              <w:t>Sécurité</w:t>
+              <w:t xml:space="preserve"> Responsable Sécurité</w:t>
             </w:r>
           </w:p>
         </w:tc>
@@ -22812,13 +22801,145 @@
     <w:p/>
     <w:p/>
     <w:p/>
+    <w:p/>
+    <w:p/>
     <w:p>
       <w:pPr>
         <w:pStyle w:val="Titre1"/>
       </w:pPr>
+      <w:r>
+        <w:lastRenderedPageBreak/>
+        <w:t>Méthodes et organisation projet</w:t>
+      </w:r>
+    </w:p>
+    <w:p/>
+    <w:p>
+      <w:pPr>
+        <w:pStyle w:val="Titre2"/>
+      </w:pPr>
+      <w:r>
+        <w:t>Agilité et suivi de projet</w:t>
+      </w:r>
+    </w:p>
+    <w:p/>
+    <w:p>
+      <w:pPr>
+        <w:pStyle w:val="Paragraphedeliste"/>
+        <w:numPr>
+          <w:ilvl w:val="0"/>
+          <w:numId w:val="82"/>
+        </w:numPr>
+      </w:pPr>
+      <w:r>
+        <w:t>Méthodologie Scrum adaptée avec sprints de 2 semaines</w:t>
+      </w:r>
+    </w:p>
+    <w:p>
+      <w:pPr>
+        <w:pStyle w:val="Paragraphedeliste"/>
+        <w:numPr>
+          <w:ilvl w:val="0"/>
+          <w:numId w:val="82"/>
+        </w:numPr>
+      </w:pPr>
+      <w:r>
+        <w:t>Daily stand-ups pour la synchronisation équipe</w:t>
+      </w:r>
+    </w:p>
+    <w:p>
+      <w:pPr>
+        <w:pStyle w:val="Paragraphedeliste"/>
+        <w:numPr>
+          <w:ilvl w:val="0"/>
+          <w:numId w:val="82"/>
+        </w:numPr>
+      </w:pPr>
+      <w:proofErr w:type="spellStart"/>
+      <w:r>
+        <w:t>Backlog</w:t>
+      </w:r>
+      <w:proofErr w:type="spellEnd"/>
+      <w:r>
+        <w:t xml:space="preserve"> priorisé avec répartition équitable des tâches</w:t>
+      </w:r>
+    </w:p>
+    <w:p>
+      <w:pPr>
+        <w:pStyle w:val="Paragraphedeliste"/>
+        <w:numPr>
+          <w:ilvl w:val="0"/>
+          <w:numId w:val="82"/>
+        </w:numPr>
+      </w:pPr>
+      <w:r>
+        <w:t>Rétrospectives pour amélioration continue</w:t>
+      </w:r>
+    </w:p>
+    <w:p/>
+    <w:p>
+      <w:pPr>
+        <w:pStyle w:val="Titre2"/>
+      </w:pPr>
+      <w:r>
+        <w:t>Outils collaboratifs</w:t>
+      </w:r>
+    </w:p>
+    <w:p/>
+    <w:p>
+      <w:pPr>
+        <w:pStyle w:val="Paragraphedeliste"/>
+        <w:numPr>
+          <w:ilvl w:val="0"/>
+          <w:numId w:val="83"/>
+        </w:numPr>
+      </w:pPr>
+      <w:r>
+        <w:t xml:space="preserve">Suivi des tâches : Utilisation d’un Kanban pour le </w:t>
+      </w:r>
+      <w:proofErr w:type="spellStart"/>
+      <w:r>
+        <w:t>backlog</w:t>
+      </w:r>
+      <w:proofErr w:type="spellEnd"/>
+    </w:p>
+    <w:p>
+      <w:pPr>
+        <w:pStyle w:val="Paragraphedeliste"/>
+        <w:numPr>
+          <w:ilvl w:val="0"/>
+          <w:numId w:val="83"/>
+        </w:numPr>
+      </w:pPr>
+      <w:r>
+        <w:t xml:space="preserve">Versioning : Gestion rigoureuse via une organisation </w:t>
+      </w:r>
+      <w:proofErr w:type="spellStart"/>
+      <w:r>
+        <w:t>Github</w:t>
+      </w:r>
+      <w:proofErr w:type="spellEnd"/>
+    </w:p>
+    <w:p>
+      <w:pPr>
+        <w:pStyle w:val="Paragraphedeliste"/>
+        <w:numPr>
+          <w:ilvl w:val="0"/>
+          <w:numId w:val="83"/>
+        </w:numPr>
+      </w:pPr>
+      <w:r>
+        <w:t>Documentation : Centralisation technique (API, Architecture)</w:t>
+      </w:r>
+    </w:p>
+    <w:p/>
+    <w:p/>
+    <w:p/>
+    <w:p>
+      <w:pPr>
+        <w:pStyle w:val="Titre1"/>
+      </w:pPr>
       <w:bookmarkStart w:id="57" w:name="_Toc222177422"/>
       <w:r>
-        <w:lastRenderedPageBreak/>
         <w:t>Prise en compte RSE et Législation</w:t>
       </w:r>
       <w:bookmarkEnd w:id="57"/>
@@ -23059,6 +23180,7 @@
       </w:pPr>
       <w:bookmarkStart w:id="59" w:name="_Toc222177425"/>
       <w:r>
+        <w:lastRenderedPageBreak/>
         <w:t>Accessibilité (a11y)</w:t>
       </w:r>
       <w:bookmarkEnd w:id="59"/>
@@ -27864,6 +27986,122 @@
     </w:lvl>
   </w:abstractNum>
   <w:abstractNum w:abstractNumId="38" w15:restartNumberingAfterBreak="0">
+    <w:nsid w:val="3F032821"/>
+    <w:multiLevelType w:val="hybridMultilevel"/>
+    <w:tmpl w:val="68EC8146"/>
+    <w:lvl w:ilvl="0" w:tplc="7252164A">
+      <w:start w:val="1"/>
+      <w:numFmt w:val="bullet"/>
+      <w:lvlText w:val=""/>
+      <w:lvlJc w:val="left"/>
+      <w:pPr>
+        <w:ind w:left="720" w:hanging="360"/>
+      </w:pPr>
+      <w:rPr>
+        <w:rFonts w:ascii="Symbol" w:hAnsi="Symbol" w:hint="default"/>
+        <w:b/>
+        <w:i w:val="0"/>
+        <w:color w:val="7A43BA"/>
+      </w:rPr>
+    </w:lvl>
+    <w:lvl w:ilvl="1" w:tplc="040C0003" w:tentative="1">
+      <w:start w:val="1"/>
+      <w:numFmt w:val="bullet"/>
+      <w:lvlText w:val="o"/>
+      <w:lvlJc w:val="left"/>
+      <w:pPr>
+        <w:ind w:left="1440" w:hanging="360"/>
+      </w:pPr>
+      <w:rPr>
+        <w:rFonts w:ascii="Courier New" w:hAnsi="Courier New" w:cs="Courier New" w:hint="default"/>
+      </w:rPr>
+    </w:lvl>
+    <w:lvl w:ilvl="2" w:tplc="040C0005" w:tentative="1">
+      <w:start w:val="1"/>
+      <w:numFmt w:val="bullet"/>
+      <w:lvlText w:val=""/>
+      <w:lvlJc w:val="left"/>
+      <w:pPr>
+        <w:ind w:left="2160" w:hanging="360"/>
+      </w:pPr>
+      <w:rPr>
+        <w:rFonts w:ascii="Wingdings" w:hAnsi="Wingdings" w:hint="default"/>
+      </w:rPr>
+    </w:lvl>
+    <w:lvl w:ilvl="3" w:tplc="040C0001" w:tentative="1">
+      <w:start w:val="1"/>
+      <w:numFmt w:val="bullet"/>
+      <w:lvlText w:val=""/>
+      <w:lvlJc w:val="left"/>
+      <w:pPr>
+        <w:ind w:left="2880" w:hanging="360"/>
+      </w:pPr>
+      <w:rPr>
+        <w:rFonts w:ascii="Symbol" w:hAnsi="Symbol" w:hint="default"/>
+      </w:rPr>
+    </w:lvl>
+    <w:lvl w:ilvl="4" w:tplc="040C0003" w:tentative="1">
+      <w:start w:val="1"/>
+      <w:numFmt w:val="bullet"/>
+      <w:lvlText w:val="o"/>
+      <w:lvlJc w:val="left"/>
+      <w:pPr>
+        <w:ind w:left="3600" w:hanging="360"/>
+      </w:pPr>
+      <w:rPr>
+        <w:rFonts w:ascii="Courier New" w:hAnsi="Courier New" w:cs="Courier New" w:hint="default"/>
+      </w:rPr>
+    </w:lvl>
+    <w:lvl w:ilvl="5" w:tplc="040C0005" w:tentative="1">
+      <w:start w:val="1"/>
+      <w:numFmt w:val="bullet"/>
+      <w:lvlText w:val=""/>
+      <w:lvlJc w:val="left"/>
+      <w:pPr>
+        <w:ind w:left="4320" w:hanging="360"/>
+      </w:pPr>
+      <w:rPr>
+        <w:rFonts w:ascii="Wingdings" w:hAnsi="Wingdings" w:hint="default"/>
+      </w:rPr>
+    </w:lvl>
+    <w:lvl w:ilvl="6" w:tplc="040C0001" w:tentative="1">
+      <w:start w:val="1"/>
+      <w:numFmt w:val="bullet"/>
+      <w:lvlText w:val=""/>
+      <w:lvlJc w:val="left"/>
+      <w:pPr>
+        <w:ind w:left="5040" w:hanging="360"/>
+      </w:pPr>
+      <w:rPr>
+        <w:rFonts w:ascii="Symbol" w:hAnsi="Symbol" w:hint="default"/>
+      </w:rPr>
+    </w:lvl>
+    <w:lvl w:ilvl="7" w:tplc="040C0003" w:tentative="1">
+      <w:start w:val="1"/>
+      <w:numFmt w:val="bullet"/>
+      <w:lvlText w:val="o"/>
+      <w:lvlJc w:val="left"/>
+      <w:pPr>
+        <w:ind w:left="5760" w:hanging="360"/>
+      </w:pPr>
+      <w:rPr>
+        <w:rFonts w:ascii="Courier New" w:hAnsi="Courier New" w:cs="Courier New" w:hint="default"/>
+      </w:rPr>
+    </w:lvl>
+    <w:lvl w:ilvl="8" w:tplc="040C0005" w:tentative="1">
+      <w:start w:val="1"/>
+      <w:numFmt w:val="bullet"/>
+      <w:lvlText w:val=""/>
+      <w:lvlJc w:val="left"/>
+      <w:pPr>
+        <w:ind w:left="6480" w:hanging="360"/>
+      </w:pPr>
+      <w:rPr>
+        <w:rFonts w:ascii="Wingdings" w:hAnsi="Wingdings" w:hint="default"/>
+      </w:rPr>
+    </w:lvl>
+  </w:abstractNum>
+  <w:abstractNum w:abstractNumId="39" w15:restartNumberingAfterBreak="0">
     <w:nsid w:val="3FB411A9"/>
     <w:multiLevelType w:val="hybridMultilevel"/>
     <w:tmpl w:val="8C1C95FC"/>
@@ -27979,7 +28217,7 @@
       </w:rPr>
     </w:lvl>
   </w:abstractNum>
-  <w:abstractNum w:abstractNumId="39" w15:restartNumberingAfterBreak="0">
+  <w:abstractNum w:abstractNumId="40" w15:restartNumberingAfterBreak="0">
     <w:nsid w:val="4005384C"/>
     <w:multiLevelType w:val="multilevel"/>
     <w:tmpl w:val="B7641252"/>
@@ -28074,7 +28312,7 @@
       </w:pPr>
     </w:lvl>
   </w:abstractNum>
-  <w:abstractNum w:abstractNumId="40" w15:restartNumberingAfterBreak="0">
+  <w:abstractNum w:abstractNumId="41" w15:restartNumberingAfterBreak="0">
     <w:nsid w:val="40663A12"/>
     <w:multiLevelType w:val="hybridMultilevel"/>
     <w:tmpl w:val="E5AEEB78"/>
@@ -28190,7 +28428,7 @@
       </w:rPr>
     </w:lvl>
   </w:abstractNum>
-  <w:abstractNum w:abstractNumId="41" w15:restartNumberingAfterBreak="0">
+  <w:abstractNum w:abstractNumId="42" w15:restartNumberingAfterBreak="0">
     <w:nsid w:val="40735042"/>
     <w:multiLevelType w:val="hybridMultilevel"/>
     <w:tmpl w:val="6276B7CC"/>
@@ -28306,7 +28544,7 @@
       </w:rPr>
     </w:lvl>
   </w:abstractNum>
-  <w:abstractNum w:abstractNumId="42" w15:restartNumberingAfterBreak="0">
+  <w:abstractNum w:abstractNumId="43" w15:restartNumberingAfterBreak="0">
     <w:nsid w:val="43FC6D31"/>
     <w:multiLevelType w:val="hybridMultilevel"/>
     <w:tmpl w:val="A2DAFDD2"/>
@@ -28422,7 +28660,7 @@
       </w:rPr>
     </w:lvl>
   </w:abstractNum>
-  <w:abstractNum w:abstractNumId="43" w15:restartNumberingAfterBreak="0">
+  <w:abstractNum w:abstractNumId="44" w15:restartNumberingAfterBreak="0">
     <w:nsid w:val="44732075"/>
     <w:multiLevelType w:val="hybridMultilevel"/>
     <w:tmpl w:val="BE22A428"/>
@@ -28538,7 +28776,7 @@
       </w:rPr>
     </w:lvl>
   </w:abstractNum>
-  <w:abstractNum w:abstractNumId="44" w15:restartNumberingAfterBreak="0">
+  <w:abstractNum w:abstractNumId="45" w15:restartNumberingAfterBreak="0">
     <w:nsid w:val="45BB693E"/>
     <w:multiLevelType w:val="hybridMultilevel"/>
     <w:tmpl w:val="8D3E181A"/>
@@ -28654,7 +28892,7 @@
       </w:rPr>
     </w:lvl>
   </w:abstractNum>
-  <w:abstractNum w:abstractNumId="45" w15:restartNumberingAfterBreak="0">
+  <w:abstractNum w:abstractNumId="46" w15:restartNumberingAfterBreak="0">
     <w:nsid w:val="487453DD"/>
     <w:multiLevelType w:val="hybridMultilevel"/>
     <w:tmpl w:val="149ADD44"/>
@@ -28770,7 +29008,7 @@
       </w:rPr>
     </w:lvl>
   </w:abstractNum>
-  <w:abstractNum w:abstractNumId="46" w15:restartNumberingAfterBreak="0">
+  <w:abstractNum w:abstractNumId="47" w15:restartNumberingAfterBreak="0">
     <w:nsid w:val="49CA1A1E"/>
     <w:multiLevelType w:val="hybridMultilevel"/>
     <w:tmpl w:val="3C169EA2"/>
@@ -28886,7 +29124,7 @@
       </w:rPr>
     </w:lvl>
   </w:abstractNum>
-  <w:abstractNum w:abstractNumId="47" w15:restartNumberingAfterBreak="0">
+  <w:abstractNum w:abstractNumId="48" w15:restartNumberingAfterBreak="0">
     <w:nsid w:val="4A2C389F"/>
     <w:multiLevelType w:val="hybridMultilevel"/>
     <w:tmpl w:val="D8D61B66"/>
@@ -29002,7 +29240,7 @@
       </w:rPr>
     </w:lvl>
   </w:abstractNum>
-  <w:abstractNum w:abstractNumId="48" w15:restartNumberingAfterBreak="0">
+  <w:abstractNum w:abstractNumId="49" w15:restartNumberingAfterBreak="0">
     <w:nsid w:val="4B3279B2"/>
     <w:multiLevelType w:val="hybridMultilevel"/>
     <w:tmpl w:val="DAD226AC"/>
@@ -29118,7 +29356,7 @@
       </w:rPr>
     </w:lvl>
   </w:abstractNum>
-  <w:abstractNum w:abstractNumId="49" w15:restartNumberingAfterBreak="0">
+  <w:abstractNum w:abstractNumId="50" w15:restartNumberingAfterBreak="0">
     <w:nsid w:val="4CD96A9C"/>
     <w:multiLevelType w:val="hybridMultilevel"/>
     <w:tmpl w:val="749AA9FC"/>
@@ -29234,7 +29472,7 @@
       </w:rPr>
     </w:lvl>
   </w:abstractNum>
-  <w:abstractNum w:abstractNumId="50" w15:restartNumberingAfterBreak="0">
+  <w:abstractNum w:abstractNumId="51" w15:restartNumberingAfterBreak="0">
     <w:nsid w:val="4E9034E5"/>
     <w:multiLevelType w:val="hybridMultilevel"/>
     <w:tmpl w:val="F2E8422E"/>
@@ -29350,7 +29588,7 @@
       </w:rPr>
     </w:lvl>
   </w:abstractNum>
-  <w:abstractNum w:abstractNumId="51" w15:restartNumberingAfterBreak="0">
+  <w:abstractNum w:abstractNumId="52" w15:restartNumberingAfterBreak="0">
     <w:nsid w:val="4ED15AEE"/>
     <w:multiLevelType w:val="multilevel"/>
     <w:tmpl w:val="372A97A4"/>
@@ -29436,7 +29674,7 @@
       </w:pPr>
     </w:lvl>
   </w:abstractNum>
-  <w:abstractNum w:abstractNumId="52" w15:restartNumberingAfterBreak="0">
+  <w:abstractNum w:abstractNumId="53" w15:restartNumberingAfterBreak="0">
     <w:nsid w:val="4F813F4B"/>
     <w:multiLevelType w:val="hybridMultilevel"/>
     <w:tmpl w:val="AC642EAC"/>
@@ -29549,7 +29787,7 @@
       </w:rPr>
     </w:lvl>
   </w:abstractNum>
-  <w:abstractNum w:abstractNumId="53" w15:restartNumberingAfterBreak="0">
+  <w:abstractNum w:abstractNumId="54" w15:restartNumberingAfterBreak="0">
     <w:nsid w:val="55346B4A"/>
     <w:multiLevelType w:val="hybridMultilevel"/>
     <w:tmpl w:val="748EF752"/>
@@ -29665,7 +29903,7 @@
       </w:rPr>
     </w:lvl>
   </w:abstractNum>
-  <w:abstractNum w:abstractNumId="54" w15:restartNumberingAfterBreak="0">
+  <w:abstractNum w:abstractNumId="55" w15:restartNumberingAfterBreak="0">
     <w:nsid w:val="56A24161"/>
     <w:multiLevelType w:val="multilevel"/>
     <w:tmpl w:val="2200AD92"/>
@@ -29751,7 +29989,7 @@
       </w:pPr>
     </w:lvl>
   </w:abstractNum>
-  <w:abstractNum w:abstractNumId="55" w15:restartNumberingAfterBreak="0">
+  <w:abstractNum w:abstractNumId="56" w15:restartNumberingAfterBreak="0">
     <w:nsid w:val="583B1C91"/>
     <w:multiLevelType w:val="hybridMultilevel"/>
     <w:tmpl w:val="2B70BD4E"/>
@@ -29840,7 +30078,7 @@
       </w:pPr>
     </w:lvl>
   </w:abstractNum>
-  <w:abstractNum w:abstractNumId="56" w15:restartNumberingAfterBreak="0">
+  <w:abstractNum w:abstractNumId="57" w15:restartNumberingAfterBreak="0">
     <w:nsid w:val="58950623"/>
     <w:multiLevelType w:val="hybridMultilevel"/>
     <w:tmpl w:val="464C371E"/>
@@ -29956,7 +30194,7 @@
       </w:rPr>
     </w:lvl>
   </w:abstractNum>
-  <w:abstractNum w:abstractNumId="57" w15:restartNumberingAfterBreak="0">
+  <w:abstractNum w:abstractNumId="58" w15:restartNumberingAfterBreak="0">
     <w:nsid w:val="5C735EAF"/>
     <w:multiLevelType w:val="hybridMultilevel"/>
     <w:tmpl w:val="308CC144"/>
@@ -30072,7 +30310,7 @@
       </w:rPr>
     </w:lvl>
   </w:abstractNum>
-  <w:abstractNum w:abstractNumId="58" w15:restartNumberingAfterBreak="0">
+  <w:abstractNum w:abstractNumId="59" w15:restartNumberingAfterBreak="0">
     <w:nsid w:val="5D0E36A8"/>
     <w:multiLevelType w:val="hybridMultilevel"/>
     <w:tmpl w:val="04126BEA"/>
@@ -30188,7 +30426,7 @@
       </w:rPr>
     </w:lvl>
   </w:abstractNum>
-  <w:abstractNum w:abstractNumId="59" w15:restartNumberingAfterBreak="0">
+  <w:abstractNum w:abstractNumId="60" w15:restartNumberingAfterBreak="0">
     <w:nsid w:val="5F0A59B2"/>
     <w:multiLevelType w:val="multilevel"/>
     <w:tmpl w:val="EE62EB52"/>
@@ -30274,7 +30512,7 @@
       </w:pPr>
     </w:lvl>
   </w:abstractNum>
-  <w:abstractNum w:abstractNumId="60" w15:restartNumberingAfterBreak="0">
+  <w:abstractNum w:abstractNumId="61" w15:restartNumberingAfterBreak="0">
     <w:nsid w:val="612C23AD"/>
     <w:multiLevelType w:val="hybridMultilevel"/>
     <w:tmpl w:val="AEA21166"/>
@@ -30390,7 +30628,7 @@
       </w:rPr>
     </w:lvl>
   </w:abstractNum>
-  <w:abstractNum w:abstractNumId="61" w15:restartNumberingAfterBreak="0">
+  <w:abstractNum w:abstractNumId="62" w15:restartNumberingAfterBreak="0">
     <w:nsid w:val="61C03D57"/>
     <w:multiLevelType w:val="hybridMultilevel"/>
     <w:tmpl w:val="038A3B10"/>
@@ -30506,7 +30744,7 @@
       </w:rPr>
     </w:lvl>
   </w:abstractNum>
-  <w:abstractNum w:abstractNumId="62" w15:restartNumberingAfterBreak="0">
+  <w:abstractNum w:abstractNumId="63" w15:restartNumberingAfterBreak="0">
     <w:nsid w:val="6245486C"/>
     <w:multiLevelType w:val="hybridMultilevel"/>
     <w:tmpl w:val="1B944042"/>
@@ -30622,7 +30860,7 @@
       </w:rPr>
     </w:lvl>
   </w:abstractNum>
-  <w:abstractNum w:abstractNumId="63" w15:restartNumberingAfterBreak="0">
+  <w:abstractNum w:abstractNumId="64" w15:restartNumberingAfterBreak="0">
     <w:nsid w:val="659962A5"/>
     <w:multiLevelType w:val="hybridMultilevel"/>
     <w:tmpl w:val="56125B50"/>
@@ -30743,7 +30981,7 @@
       </w:rPr>
     </w:lvl>
   </w:abstractNum>
-  <w:abstractNum w:abstractNumId="64" w15:restartNumberingAfterBreak="0">
+  <w:abstractNum w:abstractNumId="65" w15:restartNumberingAfterBreak="0">
     <w:nsid w:val="66006DF5"/>
     <w:multiLevelType w:val="multilevel"/>
     <w:tmpl w:val="040C001F"/>
@@ -30829,7 +31067,7 @@
       </w:pPr>
     </w:lvl>
   </w:abstractNum>
-  <w:abstractNum w:abstractNumId="65" w15:restartNumberingAfterBreak="0">
+  <w:abstractNum w:abstractNumId="66" w15:restartNumberingAfterBreak="0">
     <w:nsid w:val="67806F93"/>
     <w:multiLevelType w:val="hybridMultilevel"/>
     <w:tmpl w:val="3BB61B9E"/>
@@ -30945,7 +31183,7 @@
       </w:rPr>
     </w:lvl>
   </w:abstractNum>
-  <w:abstractNum w:abstractNumId="66" w15:restartNumberingAfterBreak="0">
+  <w:abstractNum w:abstractNumId="67" w15:restartNumberingAfterBreak="0">
     <w:nsid w:val="69581405"/>
     <w:multiLevelType w:val="multilevel"/>
     <w:tmpl w:val="040C001F"/>
@@ -31031,7 +31269,7 @@
       </w:pPr>
     </w:lvl>
   </w:abstractNum>
-  <w:abstractNum w:abstractNumId="67" w15:restartNumberingAfterBreak="0">
+  <w:abstractNum w:abstractNumId="68" w15:restartNumberingAfterBreak="0">
     <w:nsid w:val="6D0471AD"/>
     <w:multiLevelType w:val="hybridMultilevel"/>
     <w:tmpl w:val="982C7286"/>
@@ -31147,7 +31385,7 @@
       </w:rPr>
     </w:lvl>
   </w:abstractNum>
-  <w:abstractNum w:abstractNumId="68" w15:restartNumberingAfterBreak="0">
+  <w:abstractNum w:abstractNumId="69" w15:restartNumberingAfterBreak="0">
     <w:nsid w:val="72BA1C25"/>
     <w:multiLevelType w:val="hybridMultilevel"/>
     <w:tmpl w:val="FBC2C372"/>
@@ -31263,7 +31501,7 @@
       </w:rPr>
     </w:lvl>
   </w:abstractNum>
-  <w:abstractNum w:abstractNumId="69" w15:restartNumberingAfterBreak="0">
+  <w:abstractNum w:abstractNumId="70" w15:restartNumberingAfterBreak="0">
     <w:nsid w:val="72C700E6"/>
     <w:multiLevelType w:val="hybridMultilevel"/>
     <w:tmpl w:val="303608B4"/>
@@ -31379,7 +31617,7 @@
       </w:rPr>
     </w:lvl>
   </w:abstractNum>
-  <w:abstractNum w:abstractNumId="70" w15:restartNumberingAfterBreak="0">
+  <w:abstractNum w:abstractNumId="71" w15:restartNumberingAfterBreak="0">
     <w:nsid w:val="72F3271A"/>
     <w:multiLevelType w:val="hybridMultilevel"/>
     <w:tmpl w:val="7924D024"/>
@@ -31495,7 +31733,7 @@
       </w:rPr>
     </w:lvl>
   </w:abstractNum>
-  <w:abstractNum w:abstractNumId="71" w15:restartNumberingAfterBreak="0">
+  <w:abstractNum w:abstractNumId="72" w15:restartNumberingAfterBreak="0">
     <w:nsid w:val="73960FED"/>
     <w:multiLevelType w:val="hybridMultilevel"/>
     <w:tmpl w:val="4A760172"/>
@@ -31611,7 +31849,7 @@
       </w:rPr>
     </w:lvl>
   </w:abstractNum>
-  <w:abstractNum w:abstractNumId="72" w15:restartNumberingAfterBreak="0">
+  <w:abstractNum w:abstractNumId="73" w15:restartNumberingAfterBreak="0">
     <w:nsid w:val="74077A8C"/>
     <w:multiLevelType w:val="hybridMultilevel"/>
     <w:tmpl w:val="37E499F0"/>
@@ -31727,7 +31965,7 @@
       </w:rPr>
     </w:lvl>
   </w:abstractNum>
-  <w:abstractNum w:abstractNumId="73" w15:restartNumberingAfterBreak="0">
+  <w:abstractNum w:abstractNumId="74" w15:restartNumberingAfterBreak="0">
     <w:nsid w:val="746C140D"/>
     <w:multiLevelType w:val="hybridMultilevel"/>
     <w:tmpl w:val="B1F2131A"/>
@@ -31843,7 +32081,120 @@
       </w:rPr>
     </w:lvl>
   </w:abstractNum>
-  <w:abstractNum w:abstractNumId="74" w15:restartNumberingAfterBreak="0">
+  <w:abstractNum w:abstractNumId="75" w15:restartNumberingAfterBreak="0">
+    <w:nsid w:val="75A87764"/>
+    <w:multiLevelType w:val="hybridMultilevel"/>
+    <w:tmpl w:val="38CE7EDA"/>
+    <w:lvl w:ilvl="0" w:tplc="040C0001">
+      <w:start w:val="1"/>
+      <w:numFmt w:val="bullet"/>
+      <w:lvlText w:val=""/>
+      <w:lvlJc w:val="left"/>
+      <w:pPr>
+        <w:ind w:left="720" w:hanging="360"/>
+      </w:pPr>
+      <w:rPr>
+        <w:rFonts w:ascii="Symbol" w:hAnsi="Symbol" w:hint="default"/>
+      </w:rPr>
+    </w:lvl>
+    <w:lvl w:ilvl="1" w:tplc="040C0003" w:tentative="1">
+      <w:start w:val="1"/>
+      <w:numFmt w:val="bullet"/>
+      <w:lvlText w:val="o"/>
+      <w:lvlJc w:val="left"/>
+      <w:pPr>
+        <w:ind w:left="1440" w:hanging="360"/>
+      </w:pPr>
+      <w:rPr>
+        <w:rFonts w:ascii="Courier New" w:hAnsi="Courier New" w:cs="Courier New" w:hint="default"/>
+      </w:rPr>
+    </w:lvl>
+    <w:lvl w:ilvl="2" w:tplc="040C0005" w:tentative="1">
+      <w:start w:val="1"/>
+      <w:numFmt w:val="bullet"/>
+      <w:lvlText w:val=""/>
+      <w:lvlJc w:val="left"/>
+      <w:pPr>
+        <w:ind w:left="2160" w:hanging="360"/>
+      </w:pPr>
+      <w:rPr>
+        <w:rFonts w:ascii="Wingdings" w:hAnsi="Wingdings" w:hint="default"/>
+      </w:rPr>
+    </w:lvl>
+    <w:lvl w:ilvl="3" w:tplc="040C0001" w:tentative="1">
+      <w:start w:val="1"/>
+      <w:numFmt w:val="bullet"/>
+      <w:lvlText w:val=""/>
+      <w:lvlJc w:val="left"/>
+      <w:pPr>
+        <w:ind w:left="2880" w:hanging="360"/>
+      </w:pPr>
+      <w:rPr>
+        <w:rFonts w:ascii="Symbol" w:hAnsi="Symbol" w:hint="default"/>
+      </w:rPr>
+    </w:lvl>
+    <w:lvl w:ilvl="4" w:tplc="040C0003" w:tentative="1">
+      <w:start w:val="1"/>
+      <w:numFmt w:val="bullet"/>
+      <w:lvlText w:val="o"/>
+      <w:lvlJc w:val="left"/>
+      <w:pPr>
+        <w:ind w:left="3600" w:hanging="360"/>
+      </w:pPr>
+      <w:rPr>
+        <w:rFonts w:ascii="Courier New" w:hAnsi="Courier New" w:cs="Courier New" w:hint="default"/>
+      </w:rPr>
+    </w:lvl>
+    <w:lvl w:ilvl="5" w:tplc="040C0005" w:tentative="1">
+      <w:start w:val="1"/>
+      <w:numFmt w:val="bullet"/>
+      <w:lvlText w:val=""/>
+      <w:lvlJc w:val="left"/>
+      <w:pPr>
+        <w:ind w:left="4320" w:hanging="360"/>
+      </w:pPr>
+      <w:rPr>
+        <w:rFonts w:ascii="Wingdings" w:hAnsi="Wingdings" w:hint="default"/>
+      </w:rPr>
+    </w:lvl>
+    <w:lvl w:ilvl="6" w:tplc="040C0001" w:tentative="1">
+      <w:start w:val="1"/>
+      <w:numFmt w:val="bullet"/>
+      <w:lvlText w:val=""/>
+      <w:lvlJc w:val="left"/>
+      <w:pPr>
+        <w:ind w:left="5040" w:hanging="360"/>
+      </w:pPr>
+      <w:rPr>
+        <w:rFonts w:ascii="Symbol" w:hAnsi="Symbol" w:hint="default"/>
+      </w:rPr>
+    </w:lvl>
+    <w:lvl w:ilvl="7" w:tplc="040C0003" w:tentative="1">
+      <w:start w:val="1"/>
+      <w:numFmt w:val="bullet"/>
+      <w:lvlText w:val="o"/>
+      <w:lvlJc w:val="left"/>
+      <w:pPr>
+        <w:ind w:left="5760" w:hanging="360"/>
+      </w:pPr>
+      <w:rPr>
+        <w:rFonts w:ascii="Courier New" w:hAnsi="Courier New" w:cs="Courier New" w:hint="default"/>
+      </w:rPr>
+    </w:lvl>
+    <w:lvl w:ilvl="8" w:tplc="040C0005" w:tentative="1">
+      <w:start w:val="1"/>
+      <w:numFmt w:val="bullet"/>
+      <w:lvlText w:val=""/>
+      <w:lvlJc w:val="left"/>
+      <w:pPr>
+        <w:ind w:left="6480" w:hanging="360"/>
+      </w:pPr>
+      <w:rPr>
+        <w:rFonts w:ascii="Wingdings" w:hAnsi="Wingdings" w:hint="default"/>
+      </w:rPr>
+    </w:lvl>
+  </w:abstractNum>
+  <w:abstractNum w:abstractNumId="76" w15:restartNumberingAfterBreak="0">
     <w:nsid w:val="75EF17CA"/>
     <w:multiLevelType w:val="hybridMultilevel"/>
     <w:tmpl w:val="C418568A"/>
@@ -31959,7 +32310,7 @@
       </w:rPr>
     </w:lvl>
   </w:abstractNum>
-  <w:abstractNum w:abstractNumId="75" w15:restartNumberingAfterBreak="0">
+  <w:abstractNum w:abstractNumId="77" w15:restartNumberingAfterBreak="0">
     <w:nsid w:val="76420ACE"/>
     <w:multiLevelType w:val="hybridMultilevel"/>
     <w:tmpl w:val="677EC41E"/>
@@ -32075,7 +32426,7 @@
       </w:rPr>
     </w:lvl>
   </w:abstractNum>
-  <w:abstractNum w:abstractNumId="76" w15:restartNumberingAfterBreak="0">
+  <w:abstractNum w:abstractNumId="78" w15:restartNumberingAfterBreak="0">
     <w:nsid w:val="769338BB"/>
     <w:multiLevelType w:val="hybridMultilevel"/>
     <w:tmpl w:val="50A68200"/>
@@ -32191,7 +32542,123 @@
       </w:rPr>
     </w:lvl>
   </w:abstractNum>
-  <w:abstractNum w:abstractNumId="77" w15:restartNumberingAfterBreak="0">
+  <w:abstractNum w:abstractNumId="79" w15:restartNumberingAfterBreak="0">
+    <w:nsid w:val="78E35BCF"/>
+    <w:multiLevelType w:val="hybridMultilevel"/>
+    <w:tmpl w:val="DA9A09E2"/>
+    <w:lvl w:ilvl="0" w:tplc="7252164A">
+      <w:start w:val="1"/>
+      <w:numFmt w:val="bullet"/>
+      <w:lvlText w:val=""/>
+      <w:lvlJc w:val="left"/>
+      <w:pPr>
+        <w:ind w:left="720" w:hanging="360"/>
+      </w:pPr>
+      <w:rPr>
+        <w:rFonts w:ascii="Symbol" w:hAnsi="Symbol" w:hint="default"/>
+        <w:b/>
+        <w:i w:val="0"/>
+        <w:color w:val="7A43BA"/>
+      </w:rPr>
+    </w:lvl>
+    <w:lvl w:ilvl="1" w:tplc="040C0003" w:tentative="1">
+      <w:start w:val="1"/>
+      <w:numFmt w:val="bullet"/>
+      <w:lvlText w:val="o"/>
+      <w:lvlJc w:val="left"/>
+      <w:pPr>
+        <w:ind w:left="1440" w:hanging="360"/>
+      </w:pPr>
+      <w:rPr>
+        <w:rFonts w:ascii="Courier New" w:hAnsi="Courier New" w:cs="Courier New" w:hint="default"/>
+      </w:rPr>
+    </w:lvl>
+    <w:lvl w:ilvl="2" w:tplc="040C0005" w:tentative="1">
+      <w:start w:val="1"/>
+      <w:numFmt w:val="bullet"/>
+      <w:lvlText w:val=""/>
+      <w:lvlJc w:val="left"/>
+      <w:pPr>
+        <w:ind w:left="2160" w:hanging="360"/>
+      </w:pPr>
+      <w:rPr>
+        <w:rFonts w:ascii="Wingdings" w:hAnsi="Wingdings" w:hint="default"/>
+      </w:rPr>
+    </w:lvl>
+    <w:lvl w:ilvl="3" w:tplc="040C0001" w:tentative="1">
+      <w:start w:val="1"/>
+      <w:numFmt w:val="bullet"/>
+      <w:lvlText w:val=""/>
+      <w:lvlJc w:val="left"/>
+      <w:pPr>
+        <w:ind w:left="2880" w:hanging="360"/>
+      </w:pPr>
+      <w:rPr>
+        <w:rFonts w:ascii="Symbol" w:hAnsi="Symbol" w:hint="default"/>
+      </w:rPr>
+    </w:lvl>
+    <w:lvl w:ilvl="4" w:tplc="040C0003" w:tentative="1">
+      <w:start w:val="1"/>
+      <w:numFmt w:val="bullet"/>
+      <w:lvlText w:val="o"/>
+      <w:lvlJc w:val="left"/>
+      <w:pPr>
+        <w:ind w:left="3600" w:hanging="360"/>
+      </w:pPr>
+      <w:rPr>
+        <w:rFonts w:ascii="Courier New" w:hAnsi="Courier New" w:cs="Courier New" w:hint="default"/>
+      </w:rPr>
+    </w:lvl>
+    <w:lvl w:ilvl="5" w:tplc="040C0005" w:tentative="1">
+      <w:start w:val="1"/>
+      <w:numFmt w:val="bullet"/>
+      <w:lvlText w:val=""/>
+      <w:lvlJc w:val="left"/>
+      <w:pPr>
+        <w:ind w:left="4320" w:hanging="360"/>
+      </w:pPr>
+      <w:rPr>
+        <w:rFonts w:ascii="Wingdings" w:hAnsi="Wingdings" w:hint="default"/>
+      </w:rPr>
+    </w:lvl>
+    <w:lvl w:ilvl="6" w:tplc="040C0001" w:tentative="1">
+      <w:start w:val="1"/>
+      <w:numFmt w:val="bullet"/>
+      <w:lvlText w:val=""/>
+      <w:lvlJc w:val="left"/>
+      <w:pPr>
+        <w:ind w:left="5040" w:hanging="360"/>
+      </w:pPr>
+      <w:rPr>
+        <w:rFonts w:ascii="Symbol" w:hAnsi="Symbol" w:hint="default"/>
+      </w:rPr>
+    </w:lvl>
+    <w:lvl w:ilvl="7" w:tplc="040C0003" w:tentative="1">
+      <w:start w:val="1"/>
+      <w:numFmt w:val="bullet"/>
+      <w:lvlText w:val="o"/>
+      <w:lvlJc w:val="left"/>
+      <w:pPr>
+        <w:ind w:left="5760" w:hanging="360"/>
+      </w:pPr>
+      <w:rPr>
+        <w:rFonts w:ascii="Courier New" w:hAnsi="Courier New" w:cs="Courier New" w:hint="default"/>
+      </w:rPr>
+    </w:lvl>
+    <w:lvl w:ilvl="8" w:tplc="040C0005" w:tentative="1">
+      <w:start w:val="1"/>
+      <w:numFmt w:val="bullet"/>
+      <w:lvlText w:val=""/>
+      <w:lvlJc w:val="left"/>
+      <w:pPr>
+        <w:ind w:left="6480" w:hanging="360"/>
+      </w:pPr>
+      <w:rPr>
+        <w:rFonts w:ascii="Wingdings" w:hAnsi="Wingdings" w:hint="default"/>
+      </w:rPr>
+    </w:lvl>
+  </w:abstractNum>
+  <w:abstractNum w:abstractNumId="80" w15:restartNumberingAfterBreak="0">
     <w:nsid w:val="799055D3"/>
     <w:multiLevelType w:val="hybridMultilevel"/>
     <w:tmpl w:val="9C46BF24"/>
@@ -32307,7 +32774,7 @@
       </w:rPr>
     </w:lvl>
   </w:abstractNum>
-  <w:abstractNum w:abstractNumId="78" w15:restartNumberingAfterBreak="0">
+  <w:abstractNum w:abstractNumId="81" w15:restartNumberingAfterBreak="0">
     <w:nsid w:val="7ABB2DA7"/>
     <w:multiLevelType w:val="hybridMultilevel"/>
     <w:tmpl w:val="0B2A9E16"/>
@@ -32430,7 +32897,7 @@
       </w:rPr>
     </w:lvl>
   </w:abstractNum>
-  <w:abstractNum w:abstractNumId="79" w15:restartNumberingAfterBreak="0">
+  <w:abstractNum w:abstractNumId="82" w15:restartNumberingAfterBreak="0">
     <w:nsid w:val="7C5F1ACE"/>
     <w:multiLevelType w:val="hybridMultilevel"/>
     <w:tmpl w:val="29866930"/>
@@ -32550,43 +33017,43 @@
     <w:abstractNumId w:val="0"/>
   </w:num>
   <w:num w:numId="2" w16cid:durableId="447705551">
-    <w:abstractNumId w:val="54"/>
+    <w:abstractNumId w:val="55"/>
   </w:num>
   <w:num w:numId="3" w16cid:durableId="1975669920">
     <w:abstractNumId w:val="30"/>
   </w:num>
   <w:num w:numId="4" w16cid:durableId="1382049144">
-    <w:abstractNumId w:val="63"/>
+    <w:abstractNumId w:val="64"/>
   </w:num>
   <w:num w:numId="5" w16cid:durableId="286740123">
-    <w:abstractNumId w:val="52"/>
+    <w:abstractNumId w:val="53"/>
   </w:num>
   <w:num w:numId="6" w16cid:durableId="1807046575">
     <w:abstractNumId w:val="9"/>
   </w:num>
   <w:num w:numId="7" w16cid:durableId="1139298244">
-    <w:abstractNumId w:val="46"/>
+    <w:abstractNumId w:val="47"/>
   </w:num>
   <w:num w:numId="8" w16cid:durableId="752361245">
-    <w:abstractNumId w:val="51"/>
+    <w:abstractNumId w:val="52"/>
   </w:num>
   <w:num w:numId="9" w16cid:durableId="1332177032">
-    <w:abstractNumId w:val="65"/>
+    <w:abstractNumId w:val="66"/>
   </w:num>
   <w:num w:numId="10" w16cid:durableId="1729180699">
     <w:abstractNumId w:val="23"/>
   </w:num>
   <w:num w:numId="11" w16cid:durableId="1741707209">
-    <w:abstractNumId w:val="75"/>
+    <w:abstractNumId w:val="77"/>
   </w:num>
   <w:num w:numId="12" w16cid:durableId="966663697">
     <w:abstractNumId w:val="29"/>
   </w:num>
   <w:num w:numId="13" w16cid:durableId="257518811">
-    <w:abstractNumId w:val="48"/>
+    <w:abstractNumId w:val="49"/>
   </w:num>
   <w:num w:numId="14" w16cid:durableId="1561355783">
-    <w:abstractNumId w:val="67"/>
+    <w:abstractNumId w:val="68"/>
   </w:num>
   <w:num w:numId="15" w16cid:durableId="1742480173">
     <w:abstractNumId w:val="35"/>
@@ -32598,7 +33065,7 @@
     <w:abstractNumId w:val="7"/>
   </w:num>
   <w:num w:numId="18" w16cid:durableId="233903787">
-    <w:abstractNumId w:val="59"/>
+    <w:abstractNumId w:val="60"/>
   </w:num>
   <w:num w:numId="19" w16cid:durableId="311258002">
     <w:abstractNumId w:val="22"/>
@@ -32607,22 +33074,22 @@
     <w:abstractNumId w:val="4"/>
   </w:num>
   <w:num w:numId="21" w16cid:durableId="2080132253">
-    <w:abstractNumId w:val="55"/>
+    <w:abstractNumId w:val="56"/>
   </w:num>
   <w:num w:numId="22" w16cid:durableId="372312850">
-    <w:abstractNumId w:val="66"/>
+    <w:abstractNumId w:val="67"/>
   </w:num>
   <w:num w:numId="23" w16cid:durableId="287513042">
-    <w:abstractNumId w:val="39"/>
+    <w:abstractNumId w:val="40"/>
   </w:num>
   <w:num w:numId="24" w16cid:durableId="2034456600">
-    <w:abstractNumId w:val="64"/>
+    <w:abstractNumId w:val="65"/>
   </w:num>
   <w:num w:numId="25" w16cid:durableId="257520213">
-    <w:abstractNumId w:val="74"/>
+    <w:abstractNumId w:val="76"/>
   </w:num>
   <w:num w:numId="26" w16cid:durableId="2063602721">
-    <w:abstractNumId w:val="68"/>
+    <w:abstractNumId w:val="69"/>
   </w:num>
   <w:num w:numId="27" w16cid:durableId="827597472">
     <w:abstractNumId w:val="18"/>
@@ -32634,7 +33101,7 @@
     <w:abstractNumId w:val="24"/>
   </w:num>
   <w:num w:numId="30" w16cid:durableId="2126578179">
-    <w:abstractNumId w:val="62"/>
+    <w:abstractNumId w:val="63"/>
   </w:num>
   <w:num w:numId="31" w16cid:durableId="2074542746">
     <w:abstractNumId w:val="3"/>
@@ -32643,16 +33110,16 @@
     <w:abstractNumId w:val="6"/>
   </w:num>
   <w:num w:numId="33" w16cid:durableId="1419407497">
-    <w:abstractNumId w:val="77"/>
+    <w:abstractNumId w:val="80"/>
   </w:num>
   <w:num w:numId="34" w16cid:durableId="1303315933">
     <w:abstractNumId w:val="14"/>
   </w:num>
   <w:num w:numId="35" w16cid:durableId="1373379187">
-    <w:abstractNumId w:val="60"/>
+    <w:abstractNumId w:val="61"/>
   </w:num>
   <w:num w:numId="36" w16cid:durableId="229734195">
-    <w:abstractNumId w:val="43"/>
+    <w:abstractNumId w:val="44"/>
   </w:num>
   <w:num w:numId="37" w16cid:durableId="180709396">
     <w:abstractNumId w:val="15"/>
@@ -32661,13 +33128,13 @@
     <w:abstractNumId w:val="13"/>
   </w:num>
   <w:num w:numId="39" w16cid:durableId="107892262">
-    <w:abstractNumId w:val="44"/>
+    <w:abstractNumId w:val="45"/>
   </w:num>
   <w:num w:numId="40" w16cid:durableId="1019090938">
     <w:abstractNumId w:val="17"/>
   </w:num>
   <w:num w:numId="41" w16cid:durableId="1203328345">
-    <w:abstractNumId w:val="76"/>
+    <w:abstractNumId w:val="78"/>
   </w:num>
   <w:num w:numId="42" w16cid:durableId="1363939726">
     <w:abstractNumId w:val="20"/>
@@ -32676,19 +33143,19 @@
     <w:abstractNumId w:val="36"/>
   </w:num>
   <w:num w:numId="44" w16cid:durableId="194579345">
-    <w:abstractNumId w:val="73"/>
+    <w:abstractNumId w:val="74"/>
   </w:num>
   <w:num w:numId="45" w16cid:durableId="1079909322">
-    <w:abstractNumId w:val="40"/>
+    <w:abstractNumId w:val="41"/>
   </w:num>
   <w:num w:numId="46" w16cid:durableId="126971322">
-    <w:abstractNumId w:val="42"/>
+    <w:abstractNumId w:val="43"/>
   </w:num>
   <w:num w:numId="47" w16cid:durableId="1541434216">
-    <w:abstractNumId w:val="38"/>
+    <w:abstractNumId w:val="39"/>
   </w:num>
   <w:num w:numId="48" w16cid:durableId="855188858">
-    <w:abstractNumId w:val="71"/>
+    <w:abstractNumId w:val="72"/>
   </w:num>
   <w:num w:numId="49" w16cid:durableId="576283551">
     <w:abstractNumId w:val="11"/>
@@ -32697,40 +33164,40 @@
     <w:abstractNumId w:val="5"/>
   </w:num>
   <w:num w:numId="51" w16cid:durableId="514806961">
-    <w:abstractNumId w:val="45"/>
+    <w:abstractNumId w:val="46"/>
   </w:num>
   <w:num w:numId="52" w16cid:durableId="737483886">
-    <w:abstractNumId w:val="49"/>
+    <w:abstractNumId w:val="50"/>
   </w:num>
   <w:num w:numId="53" w16cid:durableId="1260987502">
-    <w:abstractNumId w:val="41"/>
+    <w:abstractNumId w:val="42"/>
   </w:num>
   <w:num w:numId="54" w16cid:durableId="694380234">
     <w:abstractNumId w:val="25"/>
   </w:num>
   <w:num w:numId="55" w16cid:durableId="1869102543">
-    <w:abstractNumId w:val="58"/>
+    <w:abstractNumId w:val="59"/>
   </w:num>
   <w:num w:numId="56" w16cid:durableId="1768884763">
-    <w:abstractNumId w:val="56"/>
+    <w:abstractNumId w:val="57"/>
   </w:num>
   <w:num w:numId="57" w16cid:durableId="662439285">
     <w:abstractNumId w:val="19"/>
   </w:num>
   <w:num w:numId="58" w16cid:durableId="1842741680">
-    <w:abstractNumId w:val="57"/>
+    <w:abstractNumId w:val="58"/>
   </w:num>
   <w:num w:numId="59" w16cid:durableId="477770105">
     <w:abstractNumId w:val="33"/>
   </w:num>
   <w:num w:numId="60" w16cid:durableId="1775324361">
-    <w:abstractNumId w:val="70"/>
+    <w:abstractNumId w:val="71"/>
   </w:num>
   <w:num w:numId="61" w16cid:durableId="21589310">
     <w:abstractNumId w:val="26"/>
   </w:num>
   <w:num w:numId="62" w16cid:durableId="955985084">
-    <w:abstractNumId w:val="53"/>
+    <w:abstractNumId w:val="54"/>
   </w:num>
   <w:num w:numId="63" w16cid:durableId="1426069588">
     <w:abstractNumId w:val="8"/>
@@ -32739,19 +33206,19 @@
     <w:abstractNumId w:val="10"/>
   </w:num>
   <w:num w:numId="65" w16cid:durableId="608436782">
-    <w:abstractNumId w:val="47"/>
+    <w:abstractNumId w:val="48"/>
   </w:num>
   <w:num w:numId="66" w16cid:durableId="1446197434">
     <w:abstractNumId w:val="2"/>
   </w:num>
   <w:num w:numId="67" w16cid:durableId="1337075609">
-    <w:abstractNumId w:val="78"/>
+    <w:abstractNumId w:val="81"/>
   </w:num>
   <w:num w:numId="68" w16cid:durableId="1913155434">
     <w:abstractNumId w:val="1"/>
   </w:num>
   <w:num w:numId="69" w16cid:durableId="711075567">
-    <w:abstractNumId w:val="61"/>
+    <w:abstractNumId w:val="62"/>
   </w:num>
   <w:num w:numId="70" w16cid:durableId="1587182874">
     <w:abstractNumId w:val="28"/>
@@ -32760,7 +33227,7 @@
     <w:abstractNumId w:val="16"/>
   </w:num>
   <w:num w:numId="72" w16cid:durableId="551623137">
-    <w:abstractNumId w:val="69"/>
+    <w:abstractNumId w:val="70"/>
   </w:num>
   <w:num w:numId="73" w16cid:durableId="1982735540">
     <w:abstractNumId w:val="37"/>
@@ -32769,7 +33236,7 @@
     <w:abstractNumId w:val="31"/>
   </w:num>
   <w:num w:numId="75" w16cid:durableId="2031491742">
-    <w:abstractNumId w:val="50"/>
+    <w:abstractNumId w:val="51"/>
   </w:num>
   <w:num w:numId="76" w16cid:durableId="153229987">
     <w:abstractNumId w:val="21"/>
@@ -32778,13 +33245,22 @@
     <w:abstractNumId w:val="12"/>
   </w:num>
   <w:num w:numId="78" w16cid:durableId="1708799062">
-    <w:abstractNumId w:val="72"/>
+    <w:abstractNumId w:val="73"/>
   </w:num>
   <w:num w:numId="79" w16cid:durableId="1599630422">
-    <w:abstractNumId w:val="79"/>
+    <w:abstractNumId w:val="82"/>
   </w:num>
   <w:num w:numId="80" w16cid:durableId="1991787635">
     <w:abstractNumId w:val="32"/>
+  </w:num>
+  <w:num w:numId="81" w16cid:durableId="2025864031">
+    <w:abstractNumId w:val="75"/>
+  </w:num>
+  <w:num w:numId="82" w16cid:durableId="1925718673">
+    <w:abstractNumId w:val="38"/>
+  </w:num>
+  <w:num w:numId="83" w16cid:durableId="788663265">
+    <w:abstractNumId w:val="79"/>
   </w:num>
 </w:numbering>
 </file>

</xml_diff>

<commit_message>
doc(note_de_cadrade): remise en ordre de la matrice de criticité
</commit_message>
<xml_diff>
--- a/note-de-cadrage/note_de_cadrage_v1.5.docx
+++ b/note-de-cadrage/note_de_cadrage_v1.5.docx
@@ -13406,7 +13406,35 @@
               <w:rPr>
                 <w:rFonts w:cs="Arial"/>
               </w:rPr>
-              <w:t>Retard sur les jalons (Bloc 1, Bloc 2, Bloc 3) – sous-estimation de la charge</w:t>
+              <w:t xml:space="preserve">Difficulté technique sur </w:t>
+            </w:r>
+            <w:proofErr w:type="spellStart"/>
+            <w:r>
+              <w:rPr>
+                <w:rFonts w:cs="Arial"/>
+              </w:rPr>
+              <w:t>Supabase</w:t>
+            </w:r>
+            <w:proofErr w:type="spellEnd"/>
+            <w:r>
+              <w:rPr>
+                <w:rFonts w:cs="Arial"/>
+              </w:rPr>
+              <w:t xml:space="preserve"> (RLS, Edge </w:t>
+            </w:r>
+            <w:proofErr w:type="spellStart"/>
+            <w:r>
+              <w:rPr>
+                <w:rFonts w:cs="Arial"/>
+              </w:rPr>
+              <w:t>Functions</w:t>
+            </w:r>
+            <w:proofErr w:type="spellEnd"/>
+            <w:r>
+              <w:rPr>
+                <w:rFonts w:cs="Arial"/>
+              </w:rPr>
+              <w:t>) bloquant le backend</w:t>
             </w:r>
           </w:p>
         </w:tc>
@@ -13425,7 +13453,7 @@
                 <w:sz w:val="22"/>
                 <w:szCs w:val="22"/>
               </w:rPr>
-              <w:t>Planning</w:t>
+              <w:t>Technique</w:t>
             </w:r>
           </w:p>
         </w:tc>
@@ -13444,7 +13472,15 @@
                 <w:sz w:val="22"/>
                 <w:szCs w:val="22"/>
               </w:rPr>
-              <w:t>Moyenne</w:t>
+              <w:t>Moyenn</w:t>
+            </w:r>
+            <w:r>
+              <w:rPr>
+                <w:rFonts w:cs="Arial"/>
+                <w:sz w:val="22"/>
+                <w:szCs w:val="22"/>
+              </w:rPr>
+              <w:t>e</w:t>
             </w:r>
           </w:p>
         </w:tc>
@@ -13463,22 +13499,19 @@
                 <w:sz w:val="22"/>
                 <w:szCs w:val="22"/>
               </w:rPr>
-              <w:t>Elevée</w:t>
+              <w:t>Moyenne</w:t>
             </w:r>
           </w:p>
         </w:tc>
         <w:tc>
           <w:tcPr>
             <w:tcW w:w="1418" w:type="dxa"/>
-            <w:shd w:val="clear" w:color="auto" w:fill="E97132" w:themeFill="accent2"/>
+            <w:shd w:val="clear" w:color="auto" w:fill="FFFF00"/>
             <w:vAlign w:val="center"/>
           </w:tcPr>
           <w:p/>
           <w:p>
             <w:pPr>
-              <w:tabs>
-                <w:tab w:val="left" w:pos="765"/>
-              </w:tabs>
               <w:jc w:val="center"/>
             </w:pPr>
             <w:r>
@@ -13486,12 +13519,16 @@
                 <w:rFonts w:cs="Arial"/>
                 <w:b/>
                 <w:bCs/>
-                <w:color w:val="FFFFFF" w:themeColor="background1"/>
                 <w:sz w:val="22"/>
                 <w:szCs w:val="22"/>
               </w:rPr>
-              <w:t>Importante</w:t>
-            </w:r>
+              <w:t>Modérée</w:t>
+            </w:r>
+          </w:p>
+          <w:p>
+            <w:pPr>
+              <w:jc w:val="center"/>
+            </w:pPr>
           </w:p>
         </w:tc>
         <w:tc>
@@ -13504,7 +13541,21 @@
               <w:rPr>
                 <w:rFonts w:cs="Arial"/>
               </w:rPr>
-              <w:t>Découper le travail en sprint courts, point hebdo d’avancement, réévaluer ma charge chaque sprint.</w:t>
+              <w:t xml:space="preserve">Monter un POC </w:t>
+            </w:r>
+            <w:proofErr w:type="spellStart"/>
+            <w:r>
+              <w:rPr>
+                <w:rFonts w:cs="Arial"/>
+              </w:rPr>
+              <w:t>Supabase</w:t>
+            </w:r>
+            <w:proofErr w:type="spellEnd"/>
+            <w:r>
+              <w:rPr>
+                <w:rFonts w:cs="Arial"/>
+              </w:rPr>
+              <w:t xml:space="preserve"> dès l’étape 1, documenter les patterns, demander de l’aide tôt au référent si blocage.</w:t>
             </w:r>
           </w:p>
         </w:tc>
@@ -13548,35 +13599,21 @@
               <w:rPr>
                 <w:rFonts w:cs="Arial"/>
               </w:rPr>
-              <w:t xml:space="preserve">Difficulté technique sur </w:t>
+              <w:t xml:space="preserve">Problème d’intégration Stripe (paiement ou </w:t>
             </w:r>
             <w:proofErr w:type="spellStart"/>
             <w:r>
               <w:rPr>
                 <w:rFonts w:cs="Arial"/>
               </w:rPr>
-              <w:t>Supabase</w:t>
+              <w:t>webhooks</w:t>
             </w:r>
             <w:proofErr w:type="spellEnd"/>
             <w:r>
               <w:rPr>
                 <w:rFonts w:cs="Arial"/>
               </w:rPr>
-              <w:t xml:space="preserve"> (RLS, Edge </w:t>
-            </w:r>
-            <w:proofErr w:type="spellStart"/>
-            <w:r>
-              <w:rPr>
-                <w:rFonts w:cs="Arial"/>
-              </w:rPr>
-              <w:t>Functions</w:t>
-            </w:r>
-            <w:proofErr w:type="spellEnd"/>
-            <w:r>
-              <w:rPr>
-                <w:rFonts w:cs="Arial"/>
-              </w:rPr>
-              <w:t>) bloquant le backend</w:t>
+              <w:t xml:space="preserve"> instables)</w:t>
             </w:r>
           </w:p>
         </w:tc>
@@ -13614,15 +13651,7 @@
                 <w:sz w:val="22"/>
                 <w:szCs w:val="22"/>
               </w:rPr>
-              <w:t>Moyenn</w:t>
-            </w:r>
-            <w:r>
-              <w:rPr>
-                <w:rFonts w:cs="Arial"/>
-                <w:sz w:val="22"/>
-                <w:szCs w:val="22"/>
-              </w:rPr>
-              <w:t>e</w:t>
+              <w:t>Moyenne</w:t>
             </w:r>
           </w:p>
         </w:tc>
@@ -13651,7 +13680,6 @@
             <w:shd w:val="clear" w:color="auto" w:fill="FFFF00"/>
             <w:vAlign w:val="center"/>
           </w:tcPr>
-          <w:p/>
           <w:p>
             <w:pPr>
               <w:jc w:val="center"/>
@@ -13666,11 +13694,6 @@
               </w:rPr>
               <w:t>Modérée</w:t>
             </w:r>
-          </w:p>
-          <w:p>
-            <w:pPr>
-              <w:jc w:val="center"/>
-            </w:pPr>
           </w:p>
         </w:tc>
         <w:tc>
@@ -13683,21 +13706,35 @@
               <w:rPr>
                 <w:rFonts w:cs="Arial"/>
               </w:rPr>
-              <w:t xml:space="preserve">Monter un POC </w:t>
+              <w:t xml:space="preserve">Utiliser l’environnement de test officiel, suivre la doc Stripe, loguer tous les </w:t>
             </w:r>
             <w:proofErr w:type="spellStart"/>
             <w:r>
               <w:rPr>
                 <w:rFonts w:cs="Arial"/>
               </w:rPr>
-              <w:t>Supabase</w:t>
+              <w:t>webhooks</w:t>
             </w:r>
             <w:proofErr w:type="spellEnd"/>
             <w:r>
               <w:rPr>
                 <w:rFonts w:cs="Arial"/>
               </w:rPr>
-              <w:t xml:space="preserve"> dès l’étape 1, documenter les patterns, demander de l’aide tôt au référent si blocage.</w:t>
+              <w:t xml:space="preserve">, prévoir un plan B </w:t>
+            </w:r>
+            <w:proofErr w:type="spellStart"/>
+            <w:r>
+              <w:rPr>
+                <w:rFonts w:cs="Arial"/>
+              </w:rPr>
+              <w:t>debug</w:t>
+            </w:r>
+            <w:proofErr w:type="spellEnd"/>
+            <w:r>
+              <w:rPr>
+                <w:rFonts w:cs="Arial"/>
+              </w:rPr>
+              <w:t>.</w:t>
             </w:r>
           </w:p>
         </w:tc>
@@ -13741,21 +13778,7 @@
               <w:rPr>
                 <w:rFonts w:cs="Arial"/>
               </w:rPr>
-              <w:t xml:space="preserve">Problème d’intégration Stripe (paiement ou </w:t>
-            </w:r>
-            <w:proofErr w:type="spellStart"/>
-            <w:r>
-              <w:rPr>
-                <w:rFonts w:cs="Arial"/>
-              </w:rPr>
-              <w:t>webhooks</w:t>
-            </w:r>
-            <w:proofErr w:type="spellEnd"/>
-            <w:r>
-              <w:rPr>
-                <w:rFonts w:cs="Arial"/>
-              </w:rPr>
-              <w:t xml:space="preserve"> instables)</w:t>
+              <w:t>Performance de recherche &gt; 100 ms sur catalogue</w:t>
             </w:r>
           </w:p>
         </w:tc>
@@ -13774,7 +13797,7 @@
                 <w:sz w:val="22"/>
                 <w:szCs w:val="22"/>
               </w:rPr>
-              <w:t>Technique</w:t>
+              <w:t>Performance</w:t>
             </w:r>
           </w:p>
         </w:tc>
@@ -13793,7 +13816,7 @@
                 <w:sz w:val="22"/>
                 <w:szCs w:val="22"/>
               </w:rPr>
-              <w:t>Moyenne</w:t>
+              <w:t>Faible</w:t>
             </w:r>
           </w:p>
         </w:tc>
@@ -13848,35 +13871,7 @@
               <w:rPr>
                 <w:rFonts w:cs="Arial"/>
               </w:rPr>
-              <w:t xml:space="preserve">Utiliser l’environnement de test officiel, suivre la doc Stripe, loguer tous les </w:t>
-            </w:r>
-            <w:proofErr w:type="spellStart"/>
-            <w:r>
-              <w:rPr>
-                <w:rFonts w:cs="Arial"/>
-              </w:rPr>
-              <w:t>webhooks</w:t>
-            </w:r>
-            <w:proofErr w:type="spellEnd"/>
-            <w:r>
-              <w:rPr>
-                <w:rFonts w:cs="Arial"/>
-              </w:rPr>
-              <w:t xml:space="preserve">, prévoir un plan B </w:t>
-            </w:r>
-            <w:proofErr w:type="spellStart"/>
-            <w:r>
-              <w:rPr>
-                <w:rFonts w:cs="Arial"/>
-              </w:rPr>
-              <w:t>debug</w:t>
-            </w:r>
-            <w:proofErr w:type="spellEnd"/>
-            <w:r>
-              <w:rPr>
-                <w:rFonts w:cs="Arial"/>
-              </w:rPr>
-              <w:t>.</w:t>
+              <w:t>Tester la recherche avec des données volumineuses, indexer correctement, limiter le nombre de champs recherchés.</w:t>
             </w:r>
           </w:p>
         </w:tc>
@@ -13907,278 +13902,6 @@
                 <w:color w:val="000000" w:themeColor="text1"/>
               </w:rPr>
               <w:t>4</w:t>
-            </w:r>
-          </w:p>
-        </w:tc>
-        <w:tc>
-          <w:tcPr>
-            <w:tcW w:w="1843" w:type="dxa"/>
-            <w:vAlign w:val="center"/>
-          </w:tcPr>
-          <w:p>
-            <w:r>
-              <w:rPr>
-                <w:rFonts w:cs="Arial"/>
-              </w:rPr>
-              <w:t>Performance de recherche &gt; 100 ms sur catalogue</w:t>
-            </w:r>
-          </w:p>
-        </w:tc>
-        <w:tc>
-          <w:tcPr>
-            <w:tcW w:w="1559" w:type="dxa"/>
-            <w:vAlign w:val="center"/>
-          </w:tcPr>
-          <w:p>
-            <w:pPr>
-              <w:jc w:val="center"/>
-            </w:pPr>
-            <w:r>
-              <w:rPr>
-                <w:rFonts w:cs="Arial"/>
-                <w:sz w:val="22"/>
-                <w:szCs w:val="22"/>
-              </w:rPr>
-              <w:t>Performance</w:t>
-            </w:r>
-          </w:p>
-        </w:tc>
-        <w:tc>
-          <w:tcPr>
-            <w:tcW w:w="1134" w:type="dxa"/>
-            <w:vAlign w:val="center"/>
-          </w:tcPr>
-          <w:p>
-            <w:pPr>
-              <w:jc w:val="center"/>
-            </w:pPr>
-            <w:r>
-              <w:rPr>
-                <w:rFonts w:cs="Arial"/>
-                <w:sz w:val="22"/>
-                <w:szCs w:val="22"/>
-              </w:rPr>
-              <w:t>Faible</w:t>
-            </w:r>
-          </w:p>
-        </w:tc>
-        <w:tc>
-          <w:tcPr>
-            <w:tcW w:w="1134" w:type="dxa"/>
-            <w:vAlign w:val="center"/>
-          </w:tcPr>
-          <w:p>
-            <w:pPr>
-              <w:jc w:val="center"/>
-            </w:pPr>
-            <w:r>
-              <w:rPr>
-                <w:rFonts w:cs="Arial"/>
-                <w:sz w:val="22"/>
-                <w:szCs w:val="22"/>
-              </w:rPr>
-              <w:t>Moyenne</w:t>
-            </w:r>
-          </w:p>
-        </w:tc>
-        <w:tc>
-          <w:tcPr>
-            <w:tcW w:w="1418" w:type="dxa"/>
-            <w:shd w:val="clear" w:color="auto" w:fill="FFFF00"/>
-            <w:vAlign w:val="center"/>
-          </w:tcPr>
-          <w:p>
-            <w:pPr>
-              <w:jc w:val="center"/>
-            </w:pPr>
-            <w:r>
-              <w:rPr>
-                <w:rFonts w:cs="Arial"/>
-                <w:b/>
-                <w:bCs/>
-                <w:sz w:val="22"/>
-                <w:szCs w:val="22"/>
-              </w:rPr>
-              <w:t>Modérée</w:t>
-            </w:r>
-          </w:p>
-        </w:tc>
-        <w:tc>
-          <w:tcPr>
-            <w:tcW w:w="2551" w:type="dxa"/>
-            <w:vAlign w:val="center"/>
-          </w:tcPr>
-          <w:p>
-            <w:r>
-              <w:rPr>
-                <w:rFonts w:cs="Arial"/>
-              </w:rPr>
-              <w:t>Tester la recherche avec des données volumineuses, indexer correctement, limiter le nombre de champs recherchés.</w:t>
-            </w:r>
-          </w:p>
-        </w:tc>
-      </w:tr>
-      <w:tr>
-        <w:trPr>
-          <w:trHeight w:val="2268"/>
-        </w:trPr>
-        <w:tc>
-          <w:tcPr>
-            <w:tcW w:w="567" w:type="dxa"/>
-            <w:shd w:val="clear" w:color="auto" w:fill="D3C1E9"/>
-            <w:vAlign w:val="center"/>
-          </w:tcPr>
-          <w:p>
-            <w:pPr>
-              <w:jc w:val="center"/>
-              <w:rPr>
-                <w:b/>
-                <w:bCs/>
-                <w:color w:val="000000" w:themeColor="text1"/>
-              </w:rPr>
-            </w:pPr>
-            <w:r>
-              <w:rPr>
-                <w:b/>
-                <w:bCs/>
-                <w:color w:val="000000" w:themeColor="text1"/>
-              </w:rPr>
-              <w:t>5</w:t>
-            </w:r>
-          </w:p>
-        </w:tc>
-        <w:tc>
-          <w:tcPr>
-            <w:tcW w:w="1843" w:type="dxa"/>
-            <w:vAlign w:val="center"/>
-          </w:tcPr>
-          <w:p>
-            <w:r>
-              <w:rPr>
-                <w:rFonts w:cs="Arial"/>
-              </w:rPr>
-              <w:t>Défaut de sécurité (mauvaise configuration RLS / RBAC / 2FA)</w:t>
-            </w:r>
-          </w:p>
-        </w:tc>
-        <w:tc>
-          <w:tcPr>
-            <w:tcW w:w="1559" w:type="dxa"/>
-            <w:vAlign w:val="center"/>
-          </w:tcPr>
-          <w:p>
-            <w:pPr>
-              <w:jc w:val="center"/>
-            </w:pPr>
-            <w:r>
-              <w:rPr>
-                <w:rFonts w:cs="Arial"/>
-                <w:sz w:val="22"/>
-                <w:szCs w:val="22"/>
-              </w:rPr>
-              <w:t>Sécurité</w:t>
-            </w:r>
-          </w:p>
-        </w:tc>
-        <w:tc>
-          <w:tcPr>
-            <w:tcW w:w="1134" w:type="dxa"/>
-            <w:vAlign w:val="center"/>
-          </w:tcPr>
-          <w:p>
-            <w:pPr>
-              <w:jc w:val="center"/>
-            </w:pPr>
-            <w:r>
-              <w:rPr>
-                <w:rFonts w:cs="Arial"/>
-                <w:sz w:val="22"/>
-                <w:szCs w:val="22"/>
-              </w:rPr>
-              <w:t>Faible</w:t>
-            </w:r>
-          </w:p>
-        </w:tc>
-        <w:tc>
-          <w:tcPr>
-            <w:tcW w:w="1134" w:type="dxa"/>
-            <w:vAlign w:val="center"/>
-          </w:tcPr>
-          <w:p/>
-          <w:p>
-            <w:pPr>
-              <w:jc w:val="center"/>
-            </w:pPr>
-            <w:r>
-              <w:t>Très Élevée</w:t>
-            </w:r>
-          </w:p>
-        </w:tc>
-        <w:tc>
-          <w:tcPr>
-            <w:tcW w:w="1418" w:type="dxa"/>
-            <w:shd w:val="clear" w:color="auto" w:fill="EE0000"/>
-            <w:vAlign w:val="center"/>
-          </w:tcPr>
-          <w:p>
-            <w:pPr>
-              <w:jc w:val="center"/>
-            </w:pPr>
-            <w:r>
-              <w:rPr>
-                <w:rFonts w:cs="Arial"/>
-                <w:b/>
-                <w:bCs/>
-                <w:color w:val="FFFFFF" w:themeColor="background1"/>
-                <w:sz w:val="22"/>
-                <w:szCs w:val="22"/>
-              </w:rPr>
-              <w:t>Critique</w:t>
-            </w:r>
-          </w:p>
-        </w:tc>
-        <w:tc>
-          <w:tcPr>
-            <w:tcW w:w="2551" w:type="dxa"/>
-            <w:vAlign w:val="center"/>
-          </w:tcPr>
-          <w:p>
-            <w:r>
-              <w:rPr>
-                <w:rFonts w:cs="Arial"/>
-              </w:rPr>
-              <w:t>Revue de sécurité systématique, tests d’accès non autorisés, check-list RGPD/PCI-DSS, validation par le référent sécu.</w:t>
-            </w:r>
-          </w:p>
-        </w:tc>
-      </w:tr>
-      <w:tr>
-        <w:trPr>
-          <w:trHeight w:val="2268"/>
-        </w:trPr>
-        <w:tc>
-          <w:tcPr>
-            <w:tcW w:w="567" w:type="dxa"/>
-            <w:shd w:val="clear" w:color="auto" w:fill="D3C1E9"/>
-            <w:vAlign w:val="center"/>
-          </w:tcPr>
-          <w:p>
-            <w:pPr>
-              <w:jc w:val="center"/>
-              <w:rPr>
-                <w:b/>
-                <w:bCs/>
-                <w:color w:val="000000" w:themeColor="text1"/>
-              </w:rPr>
-            </w:pPr>
-            <w:r>
-              <w:rPr>
-                <w:b/>
-                <w:bCs/>
-                <w:color w:val="000000" w:themeColor="text1"/>
-              </w:rPr>
-              <w:lastRenderedPageBreak/>
-              <w:t>6</w:t>
             </w:r>
           </w:p>
         </w:tc>
@@ -14325,7 +14048,7 @@
                 <w:bCs/>
                 <w:color w:val="000000" w:themeColor="text1"/>
               </w:rPr>
-              <w:t>7</w:t>
+              <w:t>5</w:t>
             </w:r>
           </w:p>
         </w:tc>
@@ -14457,7 +14180,8 @@
                 <w:bCs/>
                 <w:color w:val="000000" w:themeColor="text1"/>
               </w:rPr>
-              <w:t>8</w:t>
+              <w:lastRenderedPageBreak/>
+              <w:t>6</w:t>
             </w:r>
           </w:p>
         </w:tc>
@@ -14591,6 +14315,343 @@
           </w:p>
           <w:p/>
           <w:p/>
+        </w:tc>
+      </w:tr>
+      <w:tr>
+        <w:trPr>
+          <w:trHeight w:val="2268"/>
+        </w:trPr>
+        <w:tc>
+          <w:tcPr>
+            <w:tcW w:w="567" w:type="dxa"/>
+            <w:shd w:val="clear" w:color="auto" w:fill="D3C1E9"/>
+            <w:vAlign w:val="center"/>
+          </w:tcPr>
+          <w:p>
+            <w:pPr>
+              <w:jc w:val="center"/>
+              <w:rPr>
+                <w:b/>
+                <w:bCs/>
+                <w:color w:val="000000" w:themeColor="text1"/>
+              </w:rPr>
+            </w:pPr>
+            <w:r>
+              <w:rPr>
+                <w:b/>
+                <w:bCs/>
+                <w:color w:val="000000" w:themeColor="text1"/>
+              </w:rPr>
+              <w:t>7</w:t>
+            </w:r>
+          </w:p>
+        </w:tc>
+        <w:tc>
+          <w:tcPr>
+            <w:tcW w:w="1843" w:type="dxa"/>
+            <w:vAlign w:val="center"/>
+          </w:tcPr>
+          <w:p>
+            <w:pPr>
+              <w:rPr>
+                <w:rFonts w:cs="Arial"/>
+              </w:rPr>
+            </w:pPr>
+            <w:r>
+              <w:rPr>
+                <w:rFonts w:cs="Arial"/>
+              </w:rPr>
+              <w:t>Retard sur les jalons (Bloc 1, Bloc 2, Bloc 3) – sous-estimation de la charge</w:t>
+            </w:r>
+          </w:p>
+        </w:tc>
+        <w:tc>
+          <w:tcPr>
+            <w:tcW w:w="1559" w:type="dxa"/>
+            <w:vAlign w:val="center"/>
+          </w:tcPr>
+          <w:p>
+            <w:pPr>
+              <w:jc w:val="center"/>
+              <w:rPr>
+                <w:rFonts w:cs="Arial"/>
+                <w:sz w:val="22"/>
+                <w:szCs w:val="22"/>
+              </w:rPr>
+            </w:pPr>
+            <w:r>
+              <w:rPr>
+                <w:rFonts w:cs="Arial"/>
+                <w:sz w:val="22"/>
+                <w:szCs w:val="22"/>
+              </w:rPr>
+              <w:t>Planning</w:t>
+            </w:r>
+          </w:p>
+        </w:tc>
+        <w:tc>
+          <w:tcPr>
+            <w:tcW w:w="1134" w:type="dxa"/>
+            <w:vAlign w:val="center"/>
+          </w:tcPr>
+          <w:p>
+            <w:pPr>
+              <w:jc w:val="center"/>
+              <w:rPr>
+                <w:rFonts w:cs="Arial"/>
+                <w:sz w:val="22"/>
+                <w:szCs w:val="22"/>
+              </w:rPr>
+            </w:pPr>
+            <w:r>
+              <w:rPr>
+                <w:rFonts w:cs="Arial"/>
+                <w:sz w:val="22"/>
+                <w:szCs w:val="22"/>
+              </w:rPr>
+              <w:t>Moyenne</w:t>
+            </w:r>
+          </w:p>
+        </w:tc>
+        <w:tc>
+          <w:tcPr>
+            <w:tcW w:w="1134" w:type="dxa"/>
+            <w:vAlign w:val="center"/>
+          </w:tcPr>
+          <w:p>
+            <w:pPr>
+              <w:jc w:val="center"/>
+              <w:rPr>
+                <w:rFonts w:cs="Arial"/>
+                <w:sz w:val="22"/>
+                <w:szCs w:val="22"/>
+              </w:rPr>
+            </w:pPr>
+            <w:r>
+              <w:rPr>
+                <w:rFonts w:cs="Arial"/>
+                <w:sz w:val="22"/>
+                <w:szCs w:val="22"/>
+              </w:rPr>
+              <w:t>Elevée</w:t>
+            </w:r>
+          </w:p>
+        </w:tc>
+        <w:tc>
+          <w:tcPr>
+            <w:tcW w:w="1418" w:type="dxa"/>
+            <w:shd w:val="clear" w:color="auto" w:fill="E97132" w:themeFill="accent2"/>
+            <w:vAlign w:val="center"/>
+          </w:tcPr>
+          <w:p>
+            <w:pPr>
+              <w:jc w:val="center"/>
+              <w:rPr>
+                <w:rFonts w:cs="Arial"/>
+                <w:b/>
+                <w:bCs/>
+                <w:sz w:val="22"/>
+                <w:szCs w:val="22"/>
+              </w:rPr>
+            </w:pPr>
+            <w:r>
+              <w:rPr>
+                <w:rFonts w:cs="Arial"/>
+                <w:b/>
+                <w:bCs/>
+                <w:color w:val="FFFFFF" w:themeColor="background1"/>
+                <w:sz w:val="22"/>
+                <w:szCs w:val="22"/>
+                <w:shd w:val="clear" w:color="auto" w:fill="E97132" w:themeFill="accent2"/>
+              </w:rPr>
+              <w:t>Importante</w:t>
+            </w:r>
+          </w:p>
+        </w:tc>
+        <w:tc>
+          <w:tcPr>
+            <w:tcW w:w="2551" w:type="dxa"/>
+            <w:vAlign w:val="center"/>
+          </w:tcPr>
+          <w:p>
+            <w:pPr>
+              <w:rPr>
+                <w:rFonts w:cs="Arial"/>
+              </w:rPr>
+            </w:pPr>
+            <w:r>
+              <w:rPr>
+                <w:rFonts w:cs="Arial"/>
+              </w:rPr>
+              <w:t>Découper le travail en sprint courts, point hebdo d’avancement, réévaluer ma charge chaque sprint.</w:t>
+            </w:r>
+          </w:p>
+        </w:tc>
+      </w:tr>
+      <w:tr>
+        <w:trPr>
+          <w:trHeight w:val="2268"/>
+        </w:trPr>
+        <w:tc>
+          <w:tcPr>
+            <w:tcW w:w="567" w:type="dxa"/>
+            <w:shd w:val="clear" w:color="auto" w:fill="D3C1E9"/>
+            <w:vAlign w:val="center"/>
+          </w:tcPr>
+          <w:p>
+            <w:pPr>
+              <w:jc w:val="center"/>
+              <w:rPr>
+                <w:b/>
+                <w:bCs/>
+                <w:color w:val="000000" w:themeColor="text1"/>
+              </w:rPr>
+            </w:pPr>
+            <w:r>
+              <w:rPr>
+                <w:b/>
+                <w:bCs/>
+                <w:color w:val="000000" w:themeColor="text1"/>
+              </w:rPr>
+              <w:t>8</w:t>
+            </w:r>
+          </w:p>
+        </w:tc>
+        <w:tc>
+          <w:tcPr>
+            <w:tcW w:w="1843" w:type="dxa"/>
+            <w:vAlign w:val="center"/>
+          </w:tcPr>
+          <w:p>
+            <w:pPr>
+              <w:rPr>
+                <w:rFonts w:cs="Arial"/>
+              </w:rPr>
+            </w:pPr>
+            <w:r>
+              <w:rPr>
+                <w:rFonts w:cs="Arial"/>
+              </w:rPr>
+              <w:t>Défaut de sécurité (mauvaise configuration RLS / RBAC / 2FA)</w:t>
+            </w:r>
+          </w:p>
+        </w:tc>
+        <w:tc>
+          <w:tcPr>
+            <w:tcW w:w="1559" w:type="dxa"/>
+            <w:vAlign w:val="center"/>
+          </w:tcPr>
+          <w:p>
+            <w:pPr>
+              <w:jc w:val="center"/>
+              <w:rPr>
+                <w:rFonts w:cs="Arial"/>
+                <w:sz w:val="22"/>
+                <w:szCs w:val="22"/>
+              </w:rPr>
+            </w:pPr>
+            <w:r>
+              <w:rPr>
+                <w:rFonts w:cs="Arial"/>
+                <w:sz w:val="22"/>
+                <w:szCs w:val="22"/>
+              </w:rPr>
+              <w:t>Sécurité</w:t>
+            </w:r>
+          </w:p>
+        </w:tc>
+        <w:tc>
+          <w:tcPr>
+            <w:tcW w:w="1134" w:type="dxa"/>
+            <w:vAlign w:val="center"/>
+          </w:tcPr>
+          <w:p>
+            <w:pPr>
+              <w:jc w:val="center"/>
+              <w:rPr>
+                <w:rFonts w:cs="Arial"/>
+                <w:sz w:val="22"/>
+                <w:szCs w:val="22"/>
+              </w:rPr>
+            </w:pPr>
+            <w:r>
+              <w:rPr>
+                <w:rFonts w:cs="Arial"/>
+                <w:sz w:val="22"/>
+                <w:szCs w:val="22"/>
+              </w:rPr>
+              <w:t>Faible</w:t>
+            </w:r>
+          </w:p>
+        </w:tc>
+        <w:tc>
+          <w:tcPr>
+            <w:tcW w:w="1134" w:type="dxa"/>
+            <w:vAlign w:val="center"/>
+          </w:tcPr>
+          <w:p/>
+          <w:p>
+            <w:pPr>
+              <w:jc w:val="center"/>
+              <w:rPr>
+                <w:rFonts w:cs="Arial"/>
+                <w:sz w:val="22"/>
+                <w:szCs w:val="22"/>
+              </w:rPr>
+            </w:pPr>
+            <w:r>
+              <w:t>Très Élevée</w:t>
+            </w:r>
+          </w:p>
+        </w:tc>
+        <w:tc>
+          <w:tcPr>
+            <w:tcW w:w="1418" w:type="dxa"/>
+            <w:shd w:val="clear" w:color="auto" w:fill="C00000"/>
+            <w:vAlign w:val="center"/>
+          </w:tcPr>
+          <w:p>
+            <w:pPr>
+              <w:jc w:val="center"/>
+              <w:rPr>
+                <w:rFonts w:cs="Arial"/>
+                <w:b/>
+                <w:bCs/>
+                <w:sz w:val="22"/>
+                <w:szCs w:val="22"/>
+              </w:rPr>
+            </w:pPr>
+            <w:r>
+              <w:rPr>
+                <w:rFonts w:cs="Arial"/>
+                <w:b/>
+                <w:bCs/>
+                <w:color w:val="FFFFFF" w:themeColor="background1"/>
+                <w:sz w:val="22"/>
+                <w:szCs w:val="22"/>
+              </w:rPr>
+              <w:t>Critique</w:t>
+            </w:r>
+          </w:p>
+        </w:tc>
+        <w:tc>
+          <w:tcPr>
+            <w:tcW w:w="2551" w:type="dxa"/>
+            <w:vAlign w:val="center"/>
+          </w:tcPr>
+          <w:p>
+            <w:pPr>
+              <w:rPr>
+                <w:rFonts w:cs="Arial"/>
+              </w:rPr>
+            </w:pPr>
+            <w:r>
+              <w:rPr>
+                <w:rFonts w:cs="Arial"/>
+              </w:rPr>
+              <w:t>Revue de sécurité systématique, tests d’accès non autorisés, check-list RGPD/PCI-DSS, validation par le référent sécu.</w:t>
+            </w:r>
+          </w:p>
         </w:tc>
       </w:tr>
     </w:tbl>

</xml_diff>

<commit_message>
doc(note_de_cadrage): Ajout du diagramme d'architecture globale
</commit_message>
<xml_diff>
--- a/note-de-cadrage/note_de_cadrage_v1.5.docx
+++ b/note-de-cadrage/note_de_cadrage_v1.5.docx
@@ -14806,6 +14806,61 @@
         <w:t>) et le Paiement (Stripe).</w:t>
       </w:r>
     </w:p>
+    <w:p>
+      <w:r>
+        <w:rPr>
+          <w:noProof/>
+        </w:rPr>
+        <w:drawing>
+          <wp:inline distT="0" distB="0" distL="0" distR="0" wp14:anchorId="56048D5F" wp14:editId="15866DE5">
+            <wp:extent cx="5760720" cy="2008505"/>
+            <wp:effectExtent l="0" t="0" r="0" b="0"/>
+            <wp:docPr id="1160689749" name="Image 1" descr="Une image contenant texte, capture d’écran, nombre, Police&#10;&#10;Le contenu généré par l’IA peut être incorrect."/>
+            <wp:cNvGraphicFramePr>
+              <a:graphicFrameLocks xmlns:a="http://schemas.openxmlformats.org/drawingml/2006/main" noChangeAspect="1"/>
+            </wp:cNvGraphicFramePr>
+            <a:graphic xmlns:a="http://schemas.openxmlformats.org/drawingml/2006/main">
+              <a:graphicData uri="http://schemas.openxmlformats.org/drawingml/2006/picture">
+                <pic:pic xmlns:pic="http://schemas.openxmlformats.org/drawingml/2006/picture">
+                  <pic:nvPicPr>
+                    <pic:cNvPr id="1160689749" name="Image 1" descr="Une image contenant texte, capture d’écran, nombre, Police&#10;&#10;Le contenu généré par l’IA peut être incorrect."/>
+                    <pic:cNvPicPr>
+                      <a:picLocks noChangeAspect="1" noChangeArrowheads="1"/>
+                    </pic:cNvPicPr>
+                  </pic:nvPicPr>
+                  <pic:blipFill>
+                    <a:blip r:embed="rId10">
+                      <a:extLst>
+                        <a:ext uri="{28A0092B-C50C-407E-A947-70E740481C1C}">
+                          <a14:useLocalDpi xmlns:a14="http://schemas.microsoft.com/office/drawing/2010/main" val="0"/>
+                        </a:ext>
+                      </a:extLst>
+                    </a:blip>
+                    <a:srcRect/>
+                    <a:stretch>
+                      <a:fillRect/>
+                    </a:stretch>
+                  </pic:blipFill>
+                  <pic:spPr bwMode="auto">
+                    <a:xfrm>
+                      <a:off x="0" y="0"/>
+                      <a:ext cx="5760720" cy="2008505"/>
+                    </a:xfrm>
+                    <a:prstGeom prst="rect">
+                      <a:avLst/>
+                    </a:prstGeom>
+                    <a:noFill/>
+                    <a:ln>
+                      <a:noFill/>
+                    </a:ln>
+                  </pic:spPr>
+                </pic:pic>
+              </a:graphicData>
+            </a:graphic>
+          </wp:inline>
+        </w:drawing>
+      </w:r>
+    </w:p>
     <w:p/>
     <w:p>
       <w:pPr>
@@ -15390,6 +15445,7 @@
         <w:rPr>
           <w:b/>
         </w:rPr>
+        <w:lastRenderedPageBreak/>
         <w:t>Database</w:t>
       </w:r>
       <w:proofErr w:type="spellEnd"/>
@@ -15649,7 +15705,6 @@
         <w:pStyle w:val="Titre2"/>
       </w:pPr>
       <w:r>
-        <w:lastRenderedPageBreak/>
         <w:t xml:space="preserve"> </w:t>
       </w:r>
       <w:bookmarkStart w:id="44" w:name="_Toc222177409"/>
@@ -16642,7 +16697,6 @@
       </w:pPr>
       <w:bookmarkStart w:id="46" w:name="_Toc222177411"/>
       <w:r>
-        <w:lastRenderedPageBreak/>
         <w:t>Gouvernance (RACI)</w:t>
       </w:r>
       <w:bookmarkEnd w:id="46"/>
@@ -18083,6 +18137,7 @@
                 <w:spacing w:val="-2"/>
                 <w:sz w:val="24"/>
               </w:rPr>
+              <w:lastRenderedPageBreak/>
               <w:t>Backoffice admin (CRUD + dashboard ventes)</w:t>
             </w:r>
           </w:p>
@@ -18649,7 +18704,6 @@
                 <w:spacing w:val="-2"/>
                 <w:sz w:val="24"/>
               </w:rPr>
-              <w:lastRenderedPageBreak/>
               <w:t xml:space="preserve">CI/CD + </w:t>
             </w:r>
             <w:proofErr w:type="spellStart"/>
@@ -19707,6 +19761,7 @@
                 <w:bCs/>
                 <w:sz w:val="24"/>
               </w:rPr>
+              <w:lastRenderedPageBreak/>
               <w:t>Mohamed</w:t>
             </w:r>
             <w:r>
@@ -19824,7 +19879,7 @@
                     </pic:cNvPicPr>
                   </pic:nvPicPr>
                   <pic:blipFill>
-                    <a:blip r:embed="rId10">
+                    <a:blip r:embed="rId11">
                       <a:extLst>
                         <a:ext uri="{28A0092B-C50C-407E-A947-70E740481C1C}">
                           <a14:useLocalDpi xmlns:a14="http://schemas.microsoft.com/office/drawing/2010/main" val="0"/>
@@ -19908,7 +19963,7 @@
                     </pic:cNvPicPr>
                   </pic:nvPicPr>
                   <pic:blipFill>
-                    <a:blip r:embed="rId11">
+                    <a:blip r:embed="rId12">
                       <a:extLst>
                         <a:ext uri="{28A0092B-C50C-407E-A947-70E740481C1C}">
                           <a14:useLocalDpi xmlns:a14="http://schemas.microsoft.com/office/drawing/2010/main" val="0"/>
@@ -23583,8 +23638,8 @@
       </w:r>
     </w:p>
     <w:sectPr>
-      <w:headerReference w:type="default" r:id="rId12"/>
-      <w:footerReference w:type="default" r:id="rId13"/>
+      <w:headerReference w:type="default" r:id="rId13"/>
+      <w:footerReference w:type="default" r:id="rId14"/>
       <w:pgSz w:w="11906" w:h="16838"/>
       <w:pgMar w:top="1417" w:right="1417" w:bottom="1417" w:left="1417" w:header="708" w:footer="708" w:gutter="0"/>
       <w:pgBorders w:offsetFrom="page">

</xml_diff>